<commit_message>
corrected typos in diagrams
</commit_message>
<xml_diff>
--- a/Reports/CS699Report11292024.docx
+++ b/Reports/CS699Report11292024.docx
@@ -77,39 +77,7 @@
           <w:sz w:val="32"/>
           <w:szCs w:val="32"/>
         </w:rPr>
-        <w:t>1</w:t>
-      </w:r>
-      <w:r>
-        <w:rPr>
-          <w:rFonts w:ascii="Times New Roman" w:hAnsi="Times New Roman" w:cs="Times New Roman"/>
-          <w:sz w:val="32"/>
-          <w:szCs w:val="32"/>
-        </w:rPr>
-        <w:t>1</w:t>
-      </w:r>
-      <w:r>
-        <w:rPr>
-          <w:rFonts w:ascii="Times New Roman" w:hAnsi="Times New Roman" w:cs="Times New Roman"/>
-          <w:sz w:val="32"/>
-          <w:szCs w:val="32"/>
-        </w:rPr>
-        <w:t>/</w:t>
-      </w:r>
-      <w:r>
-        <w:rPr>
-          <w:rFonts w:ascii="Times New Roman" w:hAnsi="Times New Roman" w:cs="Times New Roman"/>
-          <w:sz w:val="32"/>
-          <w:szCs w:val="32"/>
-        </w:rPr>
-        <w:t>29</w:t>
-      </w:r>
-      <w:r>
-        <w:rPr>
-          <w:rFonts w:ascii="Times New Roman" w:hAnsi="Times New Roman" w:cs="Times New Roman"/>
-          <w:sz w:val="32"/>
-          <w:szCs w:val="32"/>
-        </w:rPr>
-        <w:t>/2024</w:t>
+        <w:t>11/29/2024</w:t>
       </w:r>
     </w:p>
     <w:p>
@@ -126,7 +94,71 @@
           <w:sz w:val="24"/>
           <w:szCs w:val="24"/>
         </w:rPr>
-        <w:t xml:space="preserve">Since the last report I have wadded through the repository to categorize the code. This process helped me understand how the dataset is cleaned, how the data frames are created and subsequently how the models have been trained. I had to pull duplicate the code into my personal repository due to my inability to push to the existing repository. Following the setup, I was able to get all the repository running and producing results. Finally, I created a block diagram for the whole codebase and another set of activity diagrams for each file to show the processes of cleaning, training, writing, and graphing the data. These diagrams are attached below. </w:t>
+        <w:t>Since the last report</w:t>
+      </w:r>
+      <w:r>
+        <w:rPr>
+          <w:rFonts w:ascii="Times New Roman" w:hAnsi="Times New Roman" w:cs="Times New Roman"/>
+          <w:sz w:val="24"/>
+          <w:szCs w:val="24"/>
+        </w:rPr>
+        <w:t xml:space="preserve"> I have</w:t>
+      </w:r>
+      <w:r>
+        <w:rPr>
+          <w:rFonts w:ascii="Times New Roman" w:hAnsi="Times New Roman" w:cs="Times New Roman"/>
+          <w:sz w:val="24"/>
+          <w:szCs w:val="24"/>
+        </w:rPr>
+        <w:t xml:space="preserve"> categorize</w:t>
+      </w:r>
+      <w:r>
+        <w:rPr>
+          <w:rFonts w:ascii="Times New Roman" w:hAnsi="Times New Roman" w:cs="Times New Roman"/>
+          <w:sz w:val="24"/>
+          <w:szCs w:val="24"/>
+        </w:rPr>
+        <w:t>d</w:t>
+      </w:r>
+      <w:r>
+        <w:rPr>
+          <w:rFonts w:ascii="Times New Roman" w:hAnsi="Times New Roman" w:cs="Times New Roman"/>
+          <w:sz w:val="24"/>
+          <w:szCs w:val="24"/>
+        </w:rPr>
+        <w:t xml:space="preserve"> the code</w:t>
+      </w:r>
+      <w:r>
+        <w:rPr>
+          <w:rFonts w:ascii="Times New Roman" w:hAnsi="Times New Roman" w:cs="Times New Roman"/>
+          <w:sz w:val="24"/>
+          <w:szCs w:val="24"/>
+        </w:rPr>
+        <w:t xml:space="preserve"> in the repository</w:t>
+      </w:r>
+      <w:r>
+        <w:rPr>
+          <w:rFonts w:ascii="Times New Roman" w:hAnsi="Times New Roman" w:cs="Times New Roman"/>
+          <w:sz w:val="24"/>
+          <w:szCs w:val="24"/>
+        </w:rPr>
+        <w:t xml:space="preserve">. This process helped me understand how the dataset is cleaned, how the data frames are created and subsequently how the models have been trained. I had to duplicate the code into my personal repository due to </w:t>
+      </w:r>
+      <w:r>
+        <w:rPr>
+          <w:rFonts w:ascii="Times New Roman" w:hAnsi="Times New Roman" w:cs="Times New Roman"/>
+          <w:sz w:val="24"/>
+          <w:szCs w:val="24"/>
+        </w:rPr>
+        <w:t xml:space="preserve">a permissions issue with the </w:t>
+      </w:r>
+      <w:r>
+        <w:rPr>
+          <w:rFonts w:ascii="Times New Roman" w:hAnsi="Times New Roman" w:cs="Times New Roman"/>
+          <w:sz w:val="24"/>
+          <w:szCs w:val="24"/>
+        </w:rPr>
+        <w:t xml:space="preserve">existing repository. Following the setup, I was able to get all the repository running and producing results. Finally, I created a block diagram for the whole codebase and a set of activity diagrams for each file to show the processes of cleaning, training, writing, and graphing the data. These diagrams are attached below. </w:t>
       </w:r>
     </w:p>
     <w:p>
@@ -187,28 +219,45 @@
           <w:sz w:val="24"/>
           <w:szCs w:val="24"/>
         </w:rPr>
-        <w:t>Wade through the results to determine which train test split percentage resulted in the highest accuracy.</w:t>
-      </w:r>
-    </w:p>
-    <w:p>
-      <w:pPr>
-        <w:rPr>
-          <w:rFonts w:ascii="Times New Roman" w:hAnsi="Times New Roman" w:cs="Times New Roman"/>
-          <w:sz w:val="24"/>
-          <w:szCs w:val="24"/>
-        </w:rPr>
-      </w:pPr>
-      <w:r>
-        <w:rPr>
-          <w:rFonts w:ascii="Times New Roman" w:hAnsi="Times New Roman" w:cs="Times New Roman"/>
+        <w:t xml:space="preserve">Process the </w:t>
+      </w:r>
+      <w:r>
+        <w:rPr>
+          <w:rFonts w:ascii="Times New Roman" w:hAnsi="Times New Roman" w:cs="Times New Roman"/>
+          <w:sz w:val="24"/>
+          <w:szCs w:val="24"/>
+        </w:rPr>
+        <w:t>results to determine which train test split percentage resulted in the highest accuracy.</w:t>
+      </w:r>
+      <w:r>
+        <w:rPr>
+          <w:rFonts w:ascii="Times New Roman" w:hAnsi="Times New Roman" w:cs="Times New Roman"/>
+          <w:noProof/>
+          <w:sz w:val="24"/>
+          <w:szCs w:val="24"/>
+        </w:rPr>
+        <w:t xml:space="preserve"> </w:t>
+      </w:r>
+      <w:r>
+        <w:rPr>
+          <w:rFonts w:ascii="Times New Roman" w:hAnsi="Times New Roman" w:cs="Times New Roman"/>
+          <w:noProof/>
           <w:sz w:val="24"/>
           <w:szCs w:val="24"/>
         </w:rPr>
         <w:drawing>
-          <wp:inline distT="0" distB="0" distL="0" distR="0" wp14:anchorId="3BAE46FC" wp14:editId="5C163551">
-            <wp:extent cx="6670854" cy="2428875"/>
+          <wp:anchor distT="0" distB="0" distL="114300" distR="114300" simplePos="0" relativeHeight="251671552" behindDoc="0" locked="0" layoutInCell="1" allowOverlap="1" wp14:anchorId="3A71508F" wp14:editId="080CDA04">
+            <wp:simplePos x="0" y="0"/>
+            <wp:positionH relativeFrom="column">
+              <wp:posOffset>0</wp:posOffset>
+            </wp:positionH>
+            <wp:positionV relativeFrom="paragraph">
+              <wp:posOffset>483870</wp:posOffset>
+            </wp:positionV>
+            <wp:extent cx="5943600" cy="2630805"/>
             <wp:effectExtent l="0" t="0" r="0" b="0"/>
-            <wp:docPr id="448192595" name="Picture 1"/>
+            <wp:wrapSquare wrapText="bothSides"/>
+            <wp:docPr id="1201253267" name="Picture 1" descr="A diagram of a diagram&#10;&#10;Description automatically generated"/>
             <wp:cNvGraphicFramePr>
               <a:graphicFrameLocks xmlns:a="http://schemas.openxmlformats.org/drawingml/2006/main" noChangeAspect="1"/>
             </wp:cNvGraphicFramePr>
@@ -216,11 +265,11 @@
               <a:graphicData uri="http://schemas.openxmlformats.org/drawingml/2006/picture">
                 <pic:pic xmlns:pic="http://schemas.openxmlformats.org/drawingml/2006/picture">
                   <pic:nvPicPr>
-                    <pic:cNvPr id="448192595" name=""/>
+                    <pic:cNvPr id="1201253267" name="Picture 1" descr="A diagram of a diagram&#10;&#10;Description automatically generated"/>
                     <pic:cNvPicPr/>
                   </pic:nvPicPr>
                   <pic:blipFill>
-                    <a:blip r:embed="rId5"/>
+                    <a:blip r:embed="rId7"/>
                     <a:stretch>
                       <a:fillRect/>
                     </a:stretch>
@@ -228,7 +277,7 @@
                   <pic:spPr>
                     <a:xfrm>
                       <a:off x="0" y="0"/>
-                      <a:ext cx="6677356" cy="2431242"/>
+                      <a:ext cx="5943600" cy="2630805"/>
                     </a:xfrm>
                     <a:prstGeom prst="rect">
                       <a:avLst/>
@@ -237,7 +286,7 @@
                 </pic:pic>
               </a:graphicData>
             </a:graphic>
-          </wp:inline>
+          </wp:anchor>
         </w:drawing>
       </w:r>
     </w:p>
@@ -249,6 +298,15 @@
           <w:szCs w:val="24"/>
         </w:rPr>
       </w:pPr>
+    </w:p>
+    <w:p>
+      <w:pPr>
+        <w:rPr>
+          <w:rFonts w:ascii="Times New Roman" w:hAnsi="Times New Roman" w:cs="Times New Roman"/>
+          <w:sz w:val="24"/>
+          <w:szCs w:val="24"/>
+        </w:rPr>
+      </w:pPr>
       <w:r>
         <w:rPr>
           <w:rFonts w:ascii="Times New Roman" w:hAnsi="Times New Roman" w:cs="Times New Roman"/>
@@ -257,10 +315,18 @@
         </w:rPr>
         <w:lastRenderedPageBreak/>
         <w:drawing>
-          <wp:inline distT="0" distB="0" distL="0" distR="0" wp14:anchorId="786D895E" wp14:editId="1A13579F">
-            <wp:extent cx="4792980" cy="8229600"/>
-            <wp:effectExtent l="0" t="0" r="7620" b="0"/>
-            <wp:docPr id="1395119347" name="Picture 1" descr="A diagram of a data flow&#10;&#10;Description automatically generated"/>
+          <wp:anchor distT="0" distB="0" distL="114300" distR="114300" simplePos="0" relativeHeight="251663360" behindDoc="0" locked="0" layoutInCell="1" allowOverlap="1" wp14:anchorId="13BED73C" wp14:editId="2AE75CFE">
+            <wp:simplePos x="0" y="0"/>
+            <wp:positionH relativeFrom="column">
+              <wp:posOffset>0</wp:posOffset>
+            </wp:positionH>
+            <wp:positionV relativeFrom="paragraph">
+              <wp:posOffset>0</wp:posOffset>
+            </wp:positionV>
+            <wp:extent cx="4238625" cy="7258050"/>
+            <wp:effectExtent l="0" t="0" r="9525" b="0"/>
+            <wp:wrapSquare wrapText="bothSides"/>
+            <wp:docPr id="1906696041" name="Picture 1" descr="A diagram of a flowchart&#10;&#10;Description automatically generated"/>
             <wp:cNvGraphicFramePr>
               <a:graphicFrameLocks xmlns:a="http://schemas.openxmlformats.org/drawingml/2006/main" noChangeAspect="1"/>
             </wp:cNvGraphicFramePr>
@@ -268,11 +334,11 @@
               <a:graphicData uri="http://schemas.openxmlformats.org/drawingml/2006/picture">
                 <pic:pic xmlns:pic="http://schemas.openxmlformats.org/drawingml/2006/picture">
                   <pic:nvPicPr>
-                    <pic:cNvPr id="1395119347" name="Picture 1" descr="A diagram of a data flow&#10;&#10;Description automatically generated"/>
+                    <pic:cNvPr id="1906696041" name="Picture 1" descr="A diagram of a flowchart&#10;&#10;Description automatically generated"/>
                     <pic:cNvPicPr/>
                   </pic:nvPicPr>
                   <pic:blipFill>
-                    <a:blip r:embed="rId6"/>
+                    <a:blip r:embed="rId8"/>
                     <a:stretch>
                       <a:fillRect/>
                     </a:stretch>
@@ -280,7 +346,7 @@
                   <pic:spPr>
                     <a:xfrm>
                       <a:off x="0" y="0"/>
-                      <a:ext cx="4792980" cy="8229600"/>
+                      <a:ext cx="4238625" cy="7258050"/>
                     </a:xfrm>
                     <a:prstGeom prst="rect">
                       <a:avLst/>
@@ -289,7 +355,7 @@
                 </pic:pic>
               </a:graphicData>
             </a:graphic>
-          </wp:inline>
+          </wp:anchor>
         </w:drawing>
       </w:r>
     </w:p>
@@ -304,6 +370,7 @@
       <w:r>
         <w:rPr>
           <w:rFonts w:ascii="Times New Roman" w:hAnsi="Times New Roman" w:cs="Times New Roman"/>
+          <w:noProof/>
           <w:sz w:val="24"/>
           <w:szCs w:val="24"/>
         </w:rPr>
@@ -324,7 +391,7 @@
                     <pic:cNvPicPr/>
                   </pic:nvPicPr>
                   <pic:blipFill>
-                    <a:blip r:embed="rId7"/>
+                    <a:blip r:embed="rId9"/>
                     <a:stretch>
                       <a:fillRect/>
                     </a:stretch>
@@ -361,10 +428,18 @@
         </w:rPr>
         <w:lastRenderedPageBreak/>
         <w:drawing>
-          <wp:inline distT="0" distB="0" distL="0" distR="0" wp14:anchorId="656FB34B" wp14:editId="2F31C25F">
+          <wp:anchor distT="0" distB="0" distL="114300" distR="114300" simplePos="0" relativeHeight="251665408" behindDoc="0" locked="0" layoutInCell="1" allowOverlap="1" wp14:anchorId="1A6E6ECD" wp14:editId="2231CB86">
+            <wp:simplePos x="0" y="0"/>
+            <wp:positionH relativeFrom="column">
+              <wp:posOffset>0</wp:posOffset>
+            </wp:positionH>
+            <wp:positionV relativeFrom="paragraph">
+              <wp:posOffset>53975</wp:posOffset>
+            </wp:positionV>
             <wp:extent cx="4200525" cy="8172450"/>
             <wp:effectExtent l="0" t="0" r="9525" b="0"/>
-            <wp:docPr id="1960828778" name="Picture 1" descr="A screenshot of a diagram&#10;&#10;Description automatically generated"/>
+            <wp:wrapSquare wrapText="bothSides"/>
+            <wp:docPr id="885066295" name="Picture 1" descr="A screenshot of a diagram&#10;&#10;Description automatically generated"/>
             <wp:cNvGraphicFramePr>
               <a:graphicFrameLocks xmlns:a="http://schemas.openxmlformats.org/drawingml/2006/main" noChangeAspect="1"/>
             </wp:cNvGraphicFramePr>
@@ -372,11 +447,11 @@
               <a:graphicData uri="http://schemas.openxmlformats.org/drawingml/2006/picture">
                 <pic:pic xmlns:pic="http://schemas.openxmlformats.org/drawingml/2006/picture">
                   <pic:nvPicPr>
-                    <pic:cNvPr id="1960828778" name="Picture 1" descr="A screenshot of a diagram&#10;&#10;Description automatically generated"/>
+                    <pic:cNvPr id="885066295" name="Picture 1" descr="A screenshot of a diagram&#10;&#10;Description automatically generated"/>
                     <pic:cNvPicPr/>
                   </pic:nvPicPr>
                   <pic:blipFill>
-                    <a:blip r:embed="rId8"/>
+                    <a:blip r:embed="rId10"/>
                     <a:stretch>
                       <a:fillRect/>
                     </a:stretch>
@@ -393,7 +468,7 @@
                 </pic:pic>
               </a:graphicData>
             </a:graphic>
-          </wp:inline>
+          </wp:anchor>
         </w:drawing>
       </w:r>
     </w:p>
@@ -405,16 +480,22 @@
       </w:pPr>
       <w:r>
         <w:rPr>
-          <w:rFonts w:ascii="Times New Roman" w:hAnsi="Times New Roman" w:cs="Times New Roman"/>
-          <w:sz w:val="24"/>
-          <w:szCs w:val="24"/>
+          <w:noProof/>
         </w:rPr>
         <w:lastRenderedPageBreak/>
         <w:drawing>
-          <wp:inline distT="0" distB="0" distL="0" distR="0" wp14:anchorId="34235FC9" wp14:editId="4737E777">
-            <wp:extent cx="2609850" cy="5200650"/>
-            <wp:effectExtent l="0" t="0" r="0" b="0"/>
-            <wp:docPr id="1582327191" name="Picture 1" descr="A diagram of a data flow&#10;&#10;Description automatically generated with medium confidence"/>
+          <wp:anchor distT="0" distB="0" distL="114300" distR="114300" simplePos="0" relativeHeight="251667456" behindDoc="0" locked="0" layoutInCell="1" allowOverlap="1" wp14:anchorId="132A7BF1" wp14:editId="6134EB77">
+            <wp:simplePos x="0" y="0"/>
+            <wp:positionH relativeFrom="column">
+              <wp:posOffset>-533400</wp:posOffset>
+            </wp:positionH>
+            <wp:positionV relativeFrom="paragraph">
+              <wp:posOffset>0</wp:posOffset>
+            </wp:positionV>
+            <wp:extent cx="4128135" cy="8229600"/>
+            <wp:effectExtent l="0" t="0" r="5715" b="0"/>
+            <wp:wrapSquare wrapText="bothSides"/>
+            <wp:docPr id="328619170" name="Picture 1" descr="A diagram of a software model&#10;&#10;Description automatically generated with medium confidence"/>
             <wp:cNvGraphicFramePr>
               <a:graphicFrameLocks xmlns:a="http://schemas.openxmlformats.org/drawingml/2006/main" noChangeAspect="1"/>
             </wp:cNvGraphicFramePr>
@@ -422,99 +503,7 @@
               <a:graphicData uri="http://schemas.openxmlformats.org/drawingml/2006/picture">
                 <pic:pic xmlns:pic="http://schemas.openxmlformats.org/drawingml/2006/picture">
                   <pic:nvPicPr>
-                    <pic:cNvPr id="1582327191" name="Picture 1" descr="A diagram of a data flow&#10;&#10;Description automatically generated with medium confidence"/>
-                    <pic:cNvPicPr/>
-                  </pic:nvPicPr>
-                  <pic:blipFill>
-                    <a:blip r:embed="rId9"/>
-                    <a:stretch>
-                      <a:fillRect/>
-                    </a:stretch>
-                  </pic:blipFill>
-                  <pic:spPr>
-                    <a:xfrm>
-                      <a:off x="0" y="0"/>
-                      <a:ext cx="2609850" cy="5200650"/>
-                    </a:xfrm>
-                    <a:prstGeom prst="rect">
-                      <a:avLst/>
-                    </a:prstGeom>
-                  </pic:spPr>
-                </pic:pic>
-              </a:graphicData>
-            </a:graphic>
-          </wp:inline>
-        </w:drawing>
-      </w:r>
-      <w:r>
-        <w:rPr>
-          <w:rFonts w:ascii="Times New Roman" w:hAnsi="Times New Roman" w:cs="Times New Roman"/>
-          <w:sz w:val="24"/>
-          <w:szCs w:val="24"/>
-        </w:rPr>
-        <w:lastRenderedPageBreak/>
-        <w:drawing>
-          <wp:inline distT="0" distB="0" distL="0" distR="0" wp14:anchorId="1E401DA3" wp14:editId="34239177">
-            <wp:extent cx="4110355" cy="8229600"/>
-            <wp:effectExtent l="0" t="0" r="4445" b="0"/>
-            <wp:docPr id="1886386159" name="Picture 1" descr="A diagram of a procedure&#10;&#10;Description automatically generated"/>
-            <wp:cNvGraphicFramePr>
-              <a:graphicFrameLocks xmlns:a="http://schemas.openxmlformats.org/drawingml/2006/main" noChangeAspect="1"/>
-            </wp:cNvGraphicFramePr>
-            <a:graphic xmlns:a="http://schemas.openxmlformats.org/drawingml/2006/main">
-              <a:graphicData uri="http://schemas.openxmlformats.org/drawingml/2006/picture">
-                <pic:pic xmlns:pic="http://schemas.openxmlformats.org/drawingml/2006/picture">
-                  <pic:nvPicPr>
-                    <pic:cNvPr id="1886386159" name="Picture 1" descr="A diagram of a procedure&#10;&#10;Description automatically generated"/>
-                    <pic:cNvPicPr/>
-                  </pic:nvPicPr>
-                  <pic:blipFill>
-                    <a:blip r:embed="rId10"/>
-                    <a:stretch>
-                      <a:fillRect/>
-                    </a:stretch>
-                  </pic:blipFill>
-                  <pic:spPr>
-                    <a:xfrm>
-                      <a:off x="0" y="0"/>
-                      <a:ext cx="4110355" cy="8229600"/>
-                    </a:xfrm>
-                    <a:prstGeom prst="rect">
-                      <a:avLst/>
-                    </a:prstGeom>
-                  </pic:spPr>
-                </pic:pic>
-              </a:graphicData>
-            </a:graphic>
-          </wp:inline>
-        </w:drawing>
-      </w:r>
-      <w:r>
-        <w:rPr>
-          <w:noProof/>
-        </w:rPr>
-        <w:t xml:space="preserve"> </w:t>
-      </w:r>
-      <w:r>
-        <w:rPr>
-          <w:rFonts w:ascii="Times New Roman" w:hAnsi="Times New Roman" w:cs="Times New Roman"/>
-          <w:sz w:val="24"/>
-          <w:szCs w:val="24"/>
-        </w:rPr>
-        <w:lastRenderedPageBreak/>
-        <w:drawing>
-          <wp:inline distT="0" distB="0" distL="0" distR="0" wp14:anchorId="3744F05E" wp14:editId="26CCA47A">
-            <wp:extent cx="2724150" cy="5667375"/>
-            <wp:effectExtent l="0" t="0" r="0" b="9525"/>
-            <wp:docPr id="191788916" name="Picture 1" descr="A diagram of a process&#10;&#10;Description automatically generated"/>
-            <wp:cNvGraphicFramePr>
-              <a:graphicFrameLocks xmlns:a="http://schemas.openxmlformats.org/drawingml/2006/main" noChangeAspect="1"/>
-            </wp:cNvGraphicFramePr>
-            <a:graphic xmlns:a="http://schemas.openxmlformats.org/drawingml/2006/main">
-              <a:graphicData uri="http://schemas.openxmlformats.org/drawingml/2006/picture">
-                <pic:pic xmlns:pic="http://schemas.openxmlformats.org/drawingml/2006/picture">
-                  <pic:nvPicPr>
-                    <pic:cNvPr id="191788916" name="Picture 1" descr="A diagram of a process&#10;&#10;Description automatically generated"/>
+                    <pic:cNvPr id="328619170" name="Picture 1" descr="A diagram of a software model&#10;&#10;Description automatically generated with medium confidence"/>
                     <pic:cNvPicPr/>
                   </pic:nvPicPr>
                   <pic:blipFill>
@@ -526,7 +515,76 @@
                   <pic:spPr>
                     <a:xfrm>
                       <a:off x="0" y="0"/>
-                      <a:ext cx="2724150" cy="5667375"/>
+                      <a:ext cx="4128135" cy="8229600"/>
+                    </a:xfrm>
+                    <a:prstGeom prst="rect">
+                      <a:avLst/>
+                    </a:prstGeom>
+                  </pic:spPr>
+                </pic:pic>
+              </a:graphicData>
+            </a:graphic>
+          </wp:anchor>
+        </w:drawing>
+      </w:r>
+      <w:r>
+        <w:rPr>
+          <w:noProof/>
+        </w:rPr>
+        <w:t xml:space="preserve"> </w:t>
+      </w:r>
+    </w:p>
+    <w:p>
+      <w:pPr>
+        <w:rPr>
+          <w:noProof/>
+        </w:rPr>
+      </w:pPr>
+    </w:p>
+    <w:p>
+      <w:pPr>
+        <w:rPr>
+          <w:rFonts w:ascii="Times New Roman" w:hAnsi="Times New Roman" w:cs="Times New Roman"/>
+          <w:sz w:val="24"/>
+          <w:szCs w:val="24"/>
+        </w:rPr>
+      </w:pPr>
+      <w:r>
+        <w:rPr>
+          <w:noProof/>
+        </w:rPr>
+        <w:lastRenderedPageBreak/>
+        <w:drawing>
+          <wp:inline distT="0" distB="0" distL="0" distR="0" wp14:anchorId="387F2652" wp14:editId="00EDDF33">
+            <wp:extent cx="3752850" cy="7505700"/>
+            <wp:effectExtent l="0" t="0" r="0" b="0"/>
+            <wp:docPr id="1936094137" name="Picture 1" descr="A diagram of a data processing process&#10;&#10;Description automatically generated"/>
+            <wp:cNvGraphicFramePr>
+              <a:graphicFrameLocks xmlns:a="http://schemas.openxmlformats.org/drawingml/2006/main" noChangeAspect="1"/>
+            </wp:cNvGraphicFramePr>
+            <a:graphic xmlns:a="http://schemas.openxmlformats.org/drawingml/2006/main">
+              <a:graphicData uri="http://schemas.openxmlformats.org/drawingml/2006/picture">
+                <pic:pic xmlns:pic="http://schemas.openxmlformats.org/drawingml/2006/picture">
+                  <pic:nvPicPr>
+                    <pic:cNvPr id="1936094137" name="Picture 1" descr="A diagram of a data processing process&#10;&#10;Description automatically generated"/>
+                    <pic:cNvPicPr/>
+                  </pic:nvPicPr>
+                  <pic:blipFill>
+                    <a:blip r:embed="rId12">
+                      <a:extLst>
+                        <a:ext uri="{28A0092B-C50C-407E-A947-70E740481C1C}">
+                          <a14:useLocalDpi xmlns:a14="http://schemas.microsoft.com/office/drawing/2010/main" val="0"/>
+                        </a:ext>
+                      </a:extLst>
+                    </a:blip>
+                    <a:stretch>
+                      <a:fillRect/>
+                    </a:stretch>
+                  </pic:blipFill>
+                  <pic:spPr>
+                    <a:xfrm>
+                      <a:off x="0" y="0"/>
+                      <a:ext cx="3752850" cy="7505700"/>
                     </a:xfrm>
                     <a:prstGeom prst="rect">
                       <a:avLst/>
@@ -543,13 +601,73 @@
       <w:pPr>
         <w:rPr>
           <w:rFonts w:ascii="Times New Roman" w:hAnsi="Times New Roman" w:cs="Times New Roman"/>
-          <w:sz w:val="24"/>
-          <w:szCs w:val="24"/>
-        </w:rPr>
-      </w:pPr>
-      <w:r>
-        <w:rPr>
-          <w:rFonts w:ascii="Times New Roman" w:hAnsi="Times New Roman" w:cs="Times New Roman"/>
+          <w:noProof/>
+          <w:sz w:val="24"/>
+          <w:szCs w:val="24"/>
+        </w:rPr>
+      </w:pPr>
+      <w:r>
+        <w:rPr>
+          <w:noProof/>
+        </w:rPr>
+        <w:lastRenderedPageBreak/>
+        <w:drawing>
+          <wp:anchor distT="0" distB="0" distL="114300" distR="114300" simplePos="0" relativeHeight="251669504" behindDoc="0" locked="0" layoutInCell="1" allowOverlap="1" wp14:anchorId="10571A74" wp14:editId="789E8631">
+            <wp:simplePos x="0" y="0"/>
+            <wp:positionH relativeFrom="column">
+              <wp:posOffset>0</wp:posOffset>
+            </wp:positionH>
+            <wp:positionV relativeFrom="paragraph">
+              <wp:posOffset>53975</wp:posOffset>
+            </wp:positionV>
+            <wp:extent cx="3924300" cy="8162925"/>
+            <wp:effectExtent l="0" t="0" r="0" b="9525"/>
+            <wp:wrapSquare wrapText="bothSides"/>
+            <wp:docPr id="1848476405" name="Picture 1" descr="A diagram of a process&#10;&#10;Description automatically generated"/>
+            <wp:cNvGraphicFramePr>
+              <a:graphicFrameLocks xmlns:a="http://schemas.openxmlformats.org/drawingml/2006/main" noChangeAspect="1"/>
+            </wp:cNvGraphicFramePr>
+            <a:graphic xmlns:a="http://schemas.openxmlformats.org/drawingml/2006/main">
+              <a:graphicData uri="http://schemas.openxmlformats.org/drawingml/2006/picture">
+                <pic:pic xmlns:pic="http://schemas.openxmlformats.org/drawingml/2006/picture">
+                  <pic:nvPicPr>
+                    <pic:cNvPr id="1848476405" name="Picture 1" descr="A diagram of a process&#10;&#10;Description automatically generated"/>
+                    <pic:cNvPicPr/>
+                  </pic:nvPicPr>
+                  <pic:blipFill>
+                    <a:blip r:embed="rId13"/>
+                    <a:stretch>
+                      <a:fillRect/>
+                    </a:stretch>
+                  </pic:blipFill>
+                  <pic:spPr>
+                    <a:xfrm>
+                      <a:off x="0" y="0"/>
+                      <a:ext cx="3924300" cy="8162925"/>
+                    </a:xfrm>
+                    <a:prstGeom prst="rect">
+                      <a:avLst/>
+                    </a:prstGeom>
+                  </pic:spPr>
+                </pic:pic>
+              </a:graphicData>
+            </a:graphic>
+          </wp:anchor>
+        </w:drawing>
+      </w:r>
+    </w:p>
+    <w:p>
+      <w:pPr>
+        <w:rPr>
+          <w:rFonts w:ascii="Times New Roman" w:hAnsi="Times New Roman" w:cs="Times New Roman"/>
+          <w:sz w:val="24"/>
+          <w:szCs w:val="24"/>
+        </w:rPr>
+      </w:pPr>
+      <w:r>
+        <w:rPr>
+          <w:rFonts w:ascii="Times New Roman" w:hAnsi="Times New Roman" w:cs="Times New Roman"/>
+          <w:noProof/>
           <w:sz w:val="24"/>
           <w:szCs w:val="24"/>
         </w:rPr>
@@ -570,7 +688,7 @@
                     <pic:cNvPicPr/>
                   </pic:nvPicPr>
                   <pic:blipFill>
-                    <a:blip r:embed="rId12"/>
+                    <a:blip r:embed="rId14"/>
                     <a:stretch>
                       <a:fillRect/>
                     </a:stretch>
@@ -599,6 +717,56 @@
     </w:sectPr>
   </w:body>
 </w:document>
+</file>
+
+<file path=word/endnotes.xml><?xml version="1.0" encoding="utf-8"?>
+<w:endnotes xmlns:wpc="http://schemas.microsoft.com/office/word/2010/wordprocessingCanvas" xmlns:cx="http://schemas.microsoft.com/office/drawing/2014/chartex" xmlns:cx1="http://schemas.microsoft.com/office/drawing/2015/9/8/chartex" xmlns:cx2="http://schemas.microsoft.com/office/drawing/2015/10/21/chartex" xmlns:cx3="http://schemas.microsoft.com/office/drawing/2016/5/9/chartex" xmlns:cx4="http://schemas.microsoft.com/office/drawing/2016/5/10/chartex" xmlns:cx5="http://schemas.microsoft.com/office/drawing/2016/5/11/chartex" xmlns:cx6="http://schemas.microsoft.com/office/drawing/2016/5/12/chartex" xmlns:cx7="http://schemas.microsoft.com/office/drawing/2016/5/13/chartex" xmlns:cx8="http://schemas.microsoft.com/office/drawing/2016/5/14/chartex" xmlns:mc="http://schemas.openxmlformats.org/markup-compatibility/2006" xmlns:aink="http://schemas.microsoft.com/office/drawing/2016/ink" xmlns:am3d="http://schemas.microsoft.com/office/drawing/2017/model3d" xmlns:o="urn:schemas-microsoft-com:office:office" xmlns:oel="http://schemas.microsoft.com/office/2019/extlst" xmlns:r="http://schemas.openxmlformats.org/officeDocument/2006/relationships" xmlns:m="http://schemas.openxmlformats.org/officeDocument/2006/math" xmlns:v="urn:schemas-microsoft-com:vml" xmlns:wp14="http://schemas.microsoft.com/office/word/2010/wordprocessingDrawing" xmlns:wp="http://schemas.openxmlformats.org/drawingml/2006/wordprocessingDrawing" xmlns:w10="urn:schemas-microsoft-com:office:word" xmlns:w="http://schemas.openxmlformats.org/wordprocessingml/2006/main" xmlns:w14="http://schemas.microsoft.com/office/word/2010/wordml" xmlns:w15="http://schemas.microsoft.com/office/word/2012/wordml" xmlns:w16cex="http://schemas.microsoft.com/office/word/2018/wordml/cex" xmlns:w16cid="http://schemas.microsoft.com/office/word/2016/wordml/cid" xmlns:w16="http://schemas.microsoft.com/office/word/2018/wordml" xmlns:w16du="http://schemas.microsoft.com/office/word/2023/wordml/word16du" xmlns:w16sdtdh="http://schemas.microsoft.com/office/word/2020/wordml/sdtdatahash" xmlns:w16se="http://schemas.microsoft.com/office/word/2015/wordml/symex" xmlns:wpg="http://schemas.microsoft.com/office/word/2010/wordprocessingGroup" xmlns:wpi="http://schemas.microsoft.com/office/word/2010/wordprocessingInk" xmlns:wne="http://schemas.microsoft.com/office/word/2006/wordml" xmlns:wps="http://schemas.microsoft.com/office/word/2010/wordprocessingShape" mc:Ignorable="w14 w15 w16se w16cid w16 w16cex w16sdtdh w16du wp14">
+  <w:endnote w:type="separator" w:id="-1">
+    <w:p>
+      <w:pPr>
+        <w:spacing w:after="0" w:line="240" w:lineRule="auto"/>
+      </w:pPr>
+      <w:r>
+        <w:separator/>
+      </w:r>
+    </w:p>
+  </w:endnote>
+  <w:endnote w:type="continuationSeparator" w:id="0">
+    <w:p>
+      <w:pPr>
+        <w:spacing w:after="0" w:line="240" w:lineRule="auto"/>
+      </w:pPr>
+      <w:r>
+        <w:continuationSeparator/>
+      </w:r>
+    </w:p>
+  </w:endnote>
+</w:endnotes>
+</file>
+
+<file path=word/footnotes.xml><?xml version="1.0" encoding="utf-8"?>
+<w:footnotes xmlns:wpc="http://schemas.microsoft.com/office/word/2010/wordprocessingCanvas" xmlns:cx="http://schemas.microsoft.com/office/drawing/2014/chartex" xmlns:cx1="http://schemas.microsoft.com/office/drawing/2015/9/8/chartex" xmlns:cx2="http://schemas.microsoft.com/office/drawing/2015/10/21/chartex" xmlns:cx3="http://schemas.microsoft.com/office/drawing/2016/5/9/chartex" xmlns:cx4="http://schemas.microsoft.com/office/drawing/2016/5/10/chartex" xmlns:cx5="http://schemas.microsoft.com/office/drawing/2016/5/11/chartex" xmlns:cx6="http://schemas.microsoft.com/office/drawing/2016/5/12/chartex" xmlns:cx7="http://schemas.microsoft.com/office/drawing/2016/5/13/chartex" xmlns:cx8="http://schemas.microsoft.com/office/drawing/2016/5/14/chartex" xmlns:mc="http://schemas.openxmlformats.org/markup-compatibility/2006" xmlns:aink="http://schemas.microsoft.com/office/drawing/2016/ink" xmlns:am3d="http://schemas.microsoft.com/office/drawing/2017/model3d" xmlns:o="urn:schemas-microsoft-com:office:office" xmlns:oel="http://schemas.microsoft.com/office/2019/extlst" xmlns:r="http://schemas.openxmlformats.org/officeDocument/2006/relationships" xmlns:m="http://schemas.openxmlformats.org/officeDocument/2006/math" xmlns:v="urn:schemas-microsoft-com:vml" xmlns:wp14="http://schemas.microsoft.com/office/word/2010/wordprocessingDrawing" xmlns:wp="http://schemas.openxmlformats.org/drawingml/2006/wordprocessingDrawing" xmlns:w10="urn:schemas-microsoft-com:office:word" xmlns:w="http://schemas.openxmlformats.org/wordprocessingml/2006/main" xmlns:w14="http://schemas.microsoft.com/office/word/2010/wordml" xmlns:w15="http://schemas.microsoft.com/office/word/2012/wordml" xmlns:w16cex="http://schemas.microsoft.com/office/word/2018/wordml/cex" xmlns:w16cid="http://schemas.microsoft.com/office/word/2016/wordml/cid" xmlns:w16="http://schemas.microsoft.com/office/word/2018/wordml" xmlns:w16du="http://schemas.microsoft.com/office/word/2023/wordml/word16du" xmlns:w16sdtdh="http://schemas.microsoft.com/office/word/2020/wordml/sdtdatahash" xmlns:w16se="http://schemas.microsoft.com/office/word/2015/wordml/symex" xmlns:wpg="http://schemas.microsoft.com/office/word/2010/wordprocessingGroup" xmlns:wpi="http://schemas.microsoft.com/office/word/2010/wordprocessingInk" xmlns:wne="http://schemas.microsoft.com/office/word/2006/wordml" xmlns:wps="http://schemas.microsoft.com/office/word/2010/wordprocessingShape" mc:Ignorable="w14 w15 w16se w16cid w16 w16cex w16sdtdh w16du wp14">
+  <w:footnote w:type="separator" w:id="-1">
+    <w:p>
+      <w:pPr>
+        <w:spacing w:after="0" w:line="240" w:lineRule="auto"/>
+      </w:pPr>
+      <w:r>
+        <w:separator/>
+      </w:r>
+    </w:p>
+  </w:footnote>
+  <w:footnote w:type="continuationSeparator" w:id="0">
+    <w:p>
+      <w:pPr>
+        <w:spacing w:after="0" w:line="240" w:lineRule="auto"/>
+      </w:pPr>
+      <w:r>
+        <w:continuationSeparator/>
+      </w:r>
+    </w:p>
+  </w:footnote>
+</w:footnotes>
 </file>
 
 <file path=word/numbering.xml><?xml version="1.0" encoding="utf-8"?>
@@ -1613,6 +1781,50 @@
       <w:spacing w:val="5"/>
     </w:rPr>
   </w:style>
+  <w:style w:type="paragraph" w:styleId="Header">
+    <w:name w:val="header"/>
+    <w:basedOn w:val="Normal"/>
+    <w:link w:val="HeaderChar"/>
+    <w:uiPriority w:val="99"/>
+    <w:unhideWhenUsed/>
+    <w:rsid w:val="000A1931"/>
+    <w:pPr>
+      <w:tabs>
+        <w:tab w:val="center" w:pos="4680"/>
+        <w:tab w:val="right" w:pos="9360"/>
+      </w:tabs>
+      <w:spacing w:after="0" w:line="240" w:lineRule="auto"/>
+    </w:pPr>
+  </w:style>
+  <w:style w:type="character" w:customStyle="1" w:styleId="HeaderChar">
+    <w:name w:val="Header Char"/>
+    <w:basedOn w:val="DefaultParagraphFont"/>
+    <w:link w:val="Header"/>
+    <w:uiPriority w:val="99"/>
+    <w:rsid w:val="000A1931"/>
+  </w:style>
+  <w:style w:type="paragraph" w:styleId="Footer">
+    <w:name w:val="footer"/>
+    <w:basedOn w:val="Normal"/>
+    <w:link w:val="FooterChar"/>
+    <w:uiPriority w:val="99"/>
+    <w:unhideWhenUsed/>
+    <w:rsid w:val="000A1931"/>
+    <w:pPr>
+      <w:tabs>
+        <w:tab w:val="center" w:pos="4680"/>
+        <w:tab w:val="right" w:pos="9360"/>
+      </w:tabs>
+      <w:spacing w:after="0" w:line="240" w:lineRule="auto"/>
+    </w:pPr>
+  </w:style>
+  <w:style w:type="character" w:customStyle="1" w:styleId="FooterChar">
+    <w:name w:val="Footer Char"/>
+    <w:basedOn w:val="DefaultParagraphFont"/>
+    <w:link w:val="Footer"/>
+    <w:uiPriority w:val="99"/>
+    <w:rsid w:val="000A1931"/>
+  </w:style>
 </w:styles>
 </file>
 

</xml_diff>